<commit_message>
docs: add security self-assessment, test report, and submission documentation generation scripts
</commit_message>
<xml_diff>
--- a/submission/06_Sandbox_Operation_Logs.docx
+++ b/submission/06_Sandbox_Operation_Logs.docx
@@ -96,7 +96,138 @@
           <w:sz w:val="22"/>
           <w:szCs w:val="22"/>
         </w:rPr>
-        <w:t>WealthPilot Team</w:t>
+        <w:t>Team Joker</w:t>
+      </w:r>
+    </w:p>
+    <w:p>
+      <w:pPr>
+        <w:spacing w:after="40"/>
+        <w:ind w:left="360"/>
+      </w:pPr>
+      <w:r>
+        <w:rPr>
+          <w:b/>
+          <w:bCs/>
+        </w:rPr>
+        <w:t>Md. Rezwanur Rahman Utshaw</w:t>
+      </w:r>
+      <w:r>
+        <w:rPr>
+          <w:color w:val="64748B"/>
+          <w:sz w:val="19"/>
+          <w:szCs w:val="19"/>
+        </w:rPr>
+        <w:t xml:space="preserve">  ·  Industrial Engineering and Management, KUET</w:t>
+      </w:r>
+    </w:p>
+    <w:p>
+      <w:pPr>
+        <w:spacing w:after="40"/>
+        <w:ind w:left="360"/>
+      </w:pPr>
+      <w:r>
+        <w:rPr>
+          <w:b/>
+          <w:bCs/>
+        </w:rPr>
+        <w:t>Gazi Faysal Jubayer</w:t>
+      </w:r>
+      <w:r>
+        <w:rPr>
+          <w:color w:val="64748B"/>
+          <w:sz w:val="19"/>
+          <w:szCs w:val="19"/>
+        </w:rPr>
+        <w:t xml:space="preserve">  ·  Mechanical Engineering, KUET</w:t>
+      </w:r>
+    </w:p>
+    <w:p>
+      <w:pPr>
+        <w:spacing w:after="40"/>
+        <w:ind w:left="360"/>
+      </w:pPr>
+      <w:r>
+        <w:rPr>
+          <w:b/>
+          <w:bCs/>
+        </w:rPr>
+        <w:t>Aseer Awsaf</w:t>
+      </w:r>
+      <w:r>
+        <w:rPr>
+          <w:color w:val="64748B"/>
+          <w:sz w:val="19"/>
+          <w:szCs w:val="19"/>
+        </w:rPr>
+        <w:t xml:space="preserve">  ·  Textile Engineering, KUET</w:t>
+      </w:r>
+    </w:p>
+    <w:p>
+      <w:pPr>
+        <w:spacing w:after="40"/>
+        <w:ind w:left="360"/>
+      </w:pPr>
+      <w:r>
+        <w:rPr>
+          <w:b/>
+          <w:bCs/>
+        </w:rPr>
+        <w:t>Salman Farshi Alam</w:t>
+      </w:r>
+      <w:r>
+        <w:rPr>
+          <w:color w:val="64748B"/>
+          <w:sz w:val="19"/>
+          <w:szCs w:val="19"/>
+        </w:rPr>
+        <w:t xml:space="preserve">  ·  Textile Engineering, KUET</w:t>
+      </w:r>
+    </w:p>
+    <w:p>
+      <w:pPr>
+        <w:spacing w:after="40"/>
+        <w:ind w:left="360"/>
+      </w:pPr>
+      <w:r>
+        <w:rPr>
+          <w:b/>
+          <w:bCs/>
+        </w:rPr>
+        <w:t>Sanjid Hasan</w:t>
+      </w:r>
+      <w:r>
+        <w:rPr>
+          <w:color w:val="64748B"/>
+          <w:sz w:val="19"/>
+          <w:szCs w:val="19"/>
+        </w:rPr>
+        <w:t xml:space="preserve">  ·  Electrical and Electronic Engineering, KUET</w:t>
+      </w:r>
+    </w:p>
+    <w:p>
+      <w:pPr>
+        <w:spacing w:after="120"/>
+        <w:ind w:left="360"/>
+      </w:pPr>
+      <w:r>
+        <w:rPr>
+          <w:i/>
+          <w:iCs/>
+          <w:color w:val="64748B"/>
+          <w:sz w:val="19"/>
+          <w:szCs w:val="19"/>
+        </w:rPr>
+        <w:t>Khulna University of Engineering &amp; Technology (KUET</w:t>
+      </w:r>
+      <w:r>
+        <w:rPr>
+          <w:i/>
+          <w:iCs/>
+          <w:color w:val="64748B"/>
+          <w:sz w:val="19"/>
+          <w:szCs w:val="19"/>
+        </w:rPr>
+        <w:t>), Bangladesh</w:t>
       </w:r>
     </w:p>
     <w:p>
@@ -113,13 +244,16 @@
         </w:rPr>
         <w:t xml:space="preserve">Live application  </w:t>
       </w:r>
-      <w:r>
-        <w:rPr>
-          <w:sz w:val="22"/>
-          <w:szCs w:val="22"/>
-        </w:rPr>
-        <w:t>to be added</w:t>
-      </w:r>
+      <w:hyperlink r:id="rId7" w:history="1">
+        <w:r>
+          <w:rPr>
+            <w:rStyle w:val="Hyperlink"/>
+            <w:sz w:val="22"/>
+            <w:szCs w:val="22"/>
+          </w:rPr>
+          <w:t>https://darkslategray-duck-848813.hostingersite.com/</w:t>
+        </w:r>
+      </w:hyperlink>
     </w:p>
     <w:p>
       <w:pPr>
@@ -135,14 +269,22 @@
         </w:rPr>
         <w:t xml:space="preserve">Source code  </w:t>
       </w:r>
-      <w:hyperlink r:id="rId7" w:history="1">
+      <w:hyperlink r:id="rId8" w:history="1">
         <w:r>
           <w:rPr>
             <w:rStyle w:val="Hyperlink"/>
             <w:sz w:val="22"/>
             <w:szCs w:val="22"/>
           </w:rPr>
-          <w:t>https://github.com/aseerawsaf45-dev/WealthPilot</w:t>
+          <w:t>https://github.com/aseera</w:t>
+        </w:r>
+        <w:r>
+          <w:rPr>
+            <w:rStyle w:val="Hyperlink"/>
+            <w:sz w:val="22"/>
+            <w:szCs w:val="22"/>
+          </w:rPr>
+          <w:t>wsaf45-dev/WealthPilot</w:t>
         </w:r>
       </w:hyperlink>
     </w:p>
@@ -192,7 +334,7 @@
     <w:sdt>
       <w:sdtPr>
         <w:alias w:val="Contents"/>
-        <w:id w:val="-387879249"/>
+        <w:id w:val="2116015510"/>
       </w:sdtPr>
       <w:sdtEndPr/>
       <w:sdtContent>
@@ -215,7 +357,7 @@
           <w:r>
             <w:fldChar w:fldCharType="separate"/>
           </w:r>
-          <w:hyperlink w:anchor="_Toc243397817" w:history="1">
+          <w:hyperlink w:anchor="_Toc243404775" w:history="1">
             <w:r>
               <w:rPr>
                 <w:rStyle w:val="Hyperlink"/>
@@ -239,7 +381,7 @@
               <w:rPr>
                 <w:noProof/>
               </w:rPr>
-              <w:instrText xml:space="preserve"> PAGEREF _Toc243397817 \h </w:instrText>
+              <w:instrText xml:space="preserve"> PAGEREF _Toc243404775 \h </w:instrText>
             </w:r>
             <w:r>
               <w:rPr>
@@ -276,7 +418,7 @@
               <w:noProof/>
             </w:rPr>
           </w:pPr>
-          <w:hyperlink w:anchor="_Toc243397818" w:history="1">
+          <w:hyperlink w:anchor="_Toc243404776" w:history="1">
             <w:r>
               <w:rPr>
                 <w:rStyle w:val="Hyperlink"/>
@@ -300,7 +442,7 @@
               <w:rPr>
                 <w:noProof/>
               </w:rPr>
-              <w:instrText xml:space="preserve"> PAGEREF _Toc243397818 \h </w:instrText>
+              <w:instrText xml:space="preserve"> PAGEREF _Toc243404776 \h </w:instrText>
             </w:r>
             <w:r>
               <w:rPr>
@@ -337,7 +479,7 @@
               <w:noProof/>
             </w:rPr>
           </w:pPr>
-          <w:hyperlink w:anchor="_Toc243397819" w:history="1">
+          <w:hyperlink w:anchor="_Toc243404777" w:history="1">
             <w:r>
               <w:rPr>
                 <w:rStyle w:val="Hyperlink"/>
@@ -361,7 +503,7 @@
               <w:rPr>
                 <w:noProof/>
               </w:rPr>
-              <w:instrText xml:space="preserve"> PAGEREF _Toc243397819 \h </w:instrText>
+              <w:instrText xml:space="preserve"> PAGEREF _Toc243404777 \h </w:instrText>
             </w:r>
             <w:r>
               <w:rPr>
@@ -398,7 +540,7 @@
               <w:noProof/>
             </w:rPr>
           </w:pPr>
-          <w:hyperlink w:anchor="_Toc243397820" w:history="1">
+          <w:hyperlink w:anchor="_Toc243404778" w:history="1">
             <w:r>
               <w:rPr>
                 <w:rStyle w:val="Hyperlink"/>
@@ -422,7 +564,7 @@
               <w:rPr>
                 <w:noProof/>
               </w:rPr>
-              <w:instrText xml:space="preserve"> PAGEREF _Toc243397820 \h </w:instrText>
+              <w:instrText xml:space="preserve"> PAGEREF _Toc243404778 \h </w:instrText>
             </w:r>
             <w:r>
               <w:rPr>
@@ -459,7 +601,7 @@
               <w:noProof/>
             </w:rPr>
           </w:pPr>
-          <w:hyperlink w:anchor="_Toc243397821" w:history="1">
+          <w:hyperlink w:anchor="_Toc243404779" w:history="1">
             <w:r>
               <w:rPr>
                 <w:rStyle w:val="Hyperlink"/>
@@ -483,7 +625,7 @@
               <w:rPr>
                 <w:noProof/>
               </w:rPr>
-              <w:instrText xml:space="preserve"> PAGEREF _Toc243397821 \h </w:instrText>
+              <w:instrText xml:space="preserve"> PAGEREF _Toc243404779 \h </w:instrText>
             </w:r>
             <w:r>
               <w:rPr>
@@ -520,7 +662,7 @@
               <w:noProof/>
             </w:rPr>
           </w:pPr>
-          <w:hyperlink w:anchor="_Toc243397822" w:history="1">
+          <w:hyperlink w:anchor="_Toc243404780" w:history="1">
             <w:r>
               <w:rPr>
                 <w:rStyle w:val="Hyperlink"/>
@@ -544,7 +686,7 @@
               <w:rPr>
                 <w:noProof/>
               </w:rPr>
-              <w:instrText xml:space="preserve"> PAGEREF _Toc243397822 \h </w:instrText>
+              <w:instrText xml:space="preserve"> PAGEREF _Toc243404780 \h </w:instrText>
             </w:r>
             <w:r>
               <w:rPr>
@@ -581,7 +723,7 @@
               <w:noProof/>
             </w:rPr>
           </w:pPr>
-          <w:hyperlink w:anchor="_Toc243397823" w:history="1">
+          <w:hyperlink w:anchor="_Toc243404781" w:history="1">
             <w:r>
               <w:rPr>
                 <w:rStyle w:val="Hyperlink"/>
@@ -605,7 +747,7 @@
               <w:rPr>
                 <w:noProof/>
               </w:rPr>
-              <w:instrText xml:space="preserve"> PAGEREF _Toc243397823 \h </w:instrText>
+              <w:instrText xml:space="preserve"> PAGEREF _Toc243404781 \h </w:instrText>
             </w:r>
             <w:r>
               <w:rPr>
@@ -651,7 +793,7 @@
           <w:sz w:val="16"/>
           <w:szCs w:val="16"/>
         </w:rPr>
-        <w:t>If the contents list is empty, right-click</w:t>
+        <w:t>If the contents list is empty, right-click it an</w:t>
       </w:r>
       <w:r>
         <w:rPr>
@@ -661,7 +803,7 @@
           <w:sz w:val="16"/>
           <w:szCs w:val="16"/>
         </w:rPr>
-        <w:t xml:space="preserve"> it and choose Update Field.</w:t>
+        <w:t>d choose Update Field.</w:t>
       </w:r>
     </w:p>
     <w:p>
@@ -673,7 +815,7 @@
       <w:pPr>
         <w:pStyle w:val="Heading1"/>
       </w:pPr>
-      <w:bookmarkStart w:id="1" w:name="_Toc243397817"/>
+      <w:bookmarkStart w:id="1" w:name="_Toc243404775"/>
       <w:r>
         <w:lastRenderedPageBreak/>
         <w:t>Simulated-Account / Sandbox Operation Logs</w:t>
@@ -711,7 +853,7 @@
       <w:pPr>
         <w:pStyle w:val="Heading2"/>
       </w:pPr>
-      <w:bookmarkStart w:id="2" w:name="_Toc243397818"/>
+      <w:bookmarkStart w:id="2" w:name="_Toc243404776"/>
       <w:r>
         <w:t>1. Environment</w:t>
       </w:r>
@@ -1223,7 +1365,7 @@
       <w:pPr>
         <w:pStyle w:val="Heading2"/>
       </w:pPr>
-      <w:bookmarkStart w:id="3" w:name="_Toc243397819"/>
+      <w:bookmarkStart w:id="3" w:name="_Toc243404777"/>
       <w:r>
         <w:t>2. Summary</w:t>
       </w:r>
@@ -2313,7 +2455,7 @@
       <w:pPr>
         <w:pStyle w:val="Heading2"/>
       </w:pPr>
-      <w:bookmarkStart w:id="4" w:name="_Toc243397820"/>
+      <w:bookmarkStart w:id="4" w:name="_Toc243404778"/>
       <w:r>
         <w:t>3. Operation log</w:t>
       </w:r>
@@ -16558,7 +16700,7 @@
       <w:pPr>
         <w:pStyle w:val="Heading2"/>
       </w:pPr>
-      <w:bookmarkStart w:id="5" w:name="_Toc243397821"/>
+      <w:bookmarkStart w:id="5" w:name="_Toc243404779"/>
       <w:r>
         <w:t>4. Security controls exercised</w:t>
       </w:r>
@@ -16579,10 +16721,10 @@
         <w:tblLook w:val="04A0" w:firstRow="1" w:lastRow="0" w:firstColumn="1" w:lastColumn="0" w:noHBand="0" w:noVBand="1"/>
       </w:tblPr>
       <w:tblGrid>
-        <w:gridCol w:w="4892"/>
-        <w:gridCol w:w="2757"/>
-        <w:gridCol w:w="5337"/>
-        <w:gridCol w:w="1692"/>
+        <w:gridCol w:w="4952"/>
+        <w:gridCol w:w="2611"/>
+        <w:gridCol w:w="5402"/>
+        <w:gridCol w:w="1713"/>
       </w:tblGrid>
       <w:tr>
         <w:trPr>
@@ -16591,7 +16733,7 @@
         </w:trPr>
         <w:tc>
           <w:tcPr>
-            <w:tcW w:w="4892" w:type="dxa"/>
+            <w:tcW w:w="4952" w:type="dxa"/>
             <w:shd w:val="clear" w:color="auto" w:fill="E2E8F0"/>
             <w:tcMar>
               <w:top w:w="50" w:type="dxa"/>
@@ -16614,7 +16756,7 @@
         </w:tc>
         <w:tc>
           <w:tcPr>
-            <w:tcW w:w="2757" w:type="dxa"/>
+            <w:tcW w:w="2611" w:type="dxa"/>
             <w:shd w:val="clear" w:color="auto" w:fill="E2E8F0"/>
             <w:tcMar>
               <w:top w:w="50" w:type="dxa"/>
@@ -16637,7 +16779,7 @@
         </w:tc>
         <w:tc>
           <w:tcPr>
-            <w:tcW w:w="5337" w:type="dxa"/>
+            <w:tcW w:w="5402" w:type="dxa"/>
             <w:shd w:val="clear" w:color="auto" w:fill="E2E8F0"/>
             <w:tcMar>
               <w:top w:w="50" w:type="dxa"/>
@@ -16660,7 +16802,7 @@
         </w:tc>
         <w:tc>
           <w:tcPr>
-            <w:tcW w:w="1692" w:type="dxa"/>
+            <w:tcW w:w="1713" w:type="dxa"/>
             <w:shd w:val="clear" w:color="auto" w:fill="E2E8F0"/>
             <w:tcMar>
               <w:top w:w="50" w:type="dxa"/>
@@ -16688,7 +16830,7 @@
         </w:trPr>
         <w:tc>
           <w:tcPr>
-            <w:tcW w:w="4892" w:type="dxa"/>
+            <w:tcW w:w="4952" w:type="dxa"/>
             <w:tcMar>
               <w:top w:w="50" w:type="dxa"/>
               <w:left w:w="90" w:type="dxa"/>
@@ -16708,7 +16850,7 @@
         </w:tc>
         <w:tc>
           <w:tcPr>
-            <w:tcW w:w="2757" w:type="dxa"/>
+            <w:tcW w:w="2611" w:type="dxa"/>
             <w:tcMar>
               <w:top w:w="50" w:type="dxa"/>
               <w:left w:w="90" w:type="dxa"/>
@@ -16730,7 +16872,7 @@
         </w:tc>
         <w:tc>
           <w:tcPr>
-            <w:tcW w:w="5337" w:type="dxa"/>
+            <w:tcW w:w="5402" w:type="dxa"/>
             <w:tcMar>
               <w:top w:w="50" w:type="dxa"/>
               <w:left w:w="90" w:type="dxa"/>
@@ -16750,7 +16892,7 @@
         </w:tc>
         <w:tc>
           <w:tcPr>
-            <w:tcW w:w="1692" w:type="dxa"/>
+            <w:tcW w:w="1713" w:type="dxa"/>
             <w:tcMar>
               <w:top w:w="50" w:type="dxa"/>
               <w:left w:w="90" w:type="dxa"/>
@@ -16775,7 +16917,7 @@
         </w:trPr>
         <w:tc>
           <w:tcPr>
-            <w:tcW w:w="4892" w:type="dxa"/>
+            <w:tcW w:w="4952" w:type="dxa"/>
             <w:tcMar>
               <w:top w:w="50" w:type="dxa"/>
               <w:left w:w="90" w:type="dxa"/>
@@ -16795,7 +16937,7 @@
         </w:tc>
         <w:tc>
           <w:tcPr>
-            <w:tcW w:w="2757" w:type="dxa"/>
+            <w:tcW w:w="2611" w:type="dxa"/>
             <w:tcMar>
               <w:top w:w="50" w:type="dxa"/>
               <w:left w:w="90" w:type="dxa"/>
@@ -16817,7 +16959,7 @@
         </w:tc>
         <w:tc>
           <w:tcPr>
-            <w:tcW w:w="5337" w:type="dxa"/>
+            <w:tcW w:w="5402" w:type="dxa"/>
             <w:tcMar>
               <w:top w:w="50" w:type="dxa"/>
               <w:left w:w="90" w:type="dxa"/>
@@ -16837,7 +16979,7 @@
         </w:tc>
         <w:tc>
           <w:tcPr>
-            <w:tcW w:w="1692" w:type="dxa"/>
+            <w:tcW w:w="1713" w:type="dxa"/>
             <w:tcMar>
               <w:top w:w="50" w:type="dxa"/>
               <w:left w:w="90" w:type="dxa"/>
@@ -16862,7 +17004,7 @@
         </w:trPr>
         <w:tc>
           <w:tcPr>
-            <w:tcW w:w="4892" w:type="dxa"/>
+            <w:tcW w:w="4952" w:type="dxa"/>
             <w:tcMar>
               <w:top w:w="50" w:type="dxa"/>
               <w:left w:w="90" w:type="dxa"/>
@@ -16882,7 +17024,7 @@
         </w:tc>
         <w:tc>
           <w:tcPr>
-            <w:tcW w:w="2757" w:type="dxa"/>
+            <w:tcW w:w="2611" w:type="dxa"/>
             <w:tcMar>
               <w:top w:w="50" w:type="dxa"/>
               <w:left w:w="90" w:type="dxa"/>
@@ -16904,7 +17046,7 @@
         </w:tc>
         <w:tc>
           <w:tcPr>
-            <w:tcW w:w="5337" w:type="dxa"/>
+            <w:tcW w:w="5402" w:type="dxa"/>
             <w:tcMar>
               <w:top w:w="50" w:type="dxa"/>
               <w:left w:w="90" w:type="dxa"/>
@@ -16924,7 +17066,7 @@
         </w:tc>
         <w:tc>
           <w:tcPr>
-            <w:tcW w:w="1692" w:type="dxa"/>
+            <w:tcW w:w="1713" w:type="dxa"/>
             <w:tcMar>
               <w:top w:w="50" w:type="dxa"/>
               <w:left w:w="90" w:type="dxa"/>
@@ -16949,7 +17091,7 @@
         </w:trPr>
         <w:tc>
           <w:tcPr>
-            <w:tcW w:w="4892" w:type="dxa"/>
+            <w:tcW w:w="4952" w:type="dxa"/>
             <w:tcMar>
               <w:top w:w="50" w:type="dxa"/>
               <w:left w:w="90" w:type="dxa"/>
@@ -16969,7 +17111,7 @@
         </w:tc>
         <w:tc>
           <w:tcPr>
-            <w:tcW w:w="2757" w:type="dxa"/>
+            <w:tcW w:w="2611" w:type="dxa"/>
             <w:tcMar>
               <w:top w:w="50" w:type="dxa"/>
               <w:left w:w="90" w:type="dxa"/>
@@ -16991,7 +17133,7 @@
         </w:tc>
         <w:tc>
           <w:tcPr>
-            <w:tcW w:w="5337" w:type="dxa"/>
+            <w:tcW w:w="5402" w:type="dxa"/>
             <w:tcMar>
               <w:top w:w="50" w:type="dxa"/>
               <w:left w:w="90" w:type="dxa"/>
@@ -17011,7 +17153,7 @@
         </w:tc>
         <w:tc>
           <w:tcPr>
-            <w:tcW w:w="1692" w:type="dxa"/>
+            <w:tcW w:w="1713" w:type="dxa"/>
             <w:tcMar>
               <w:top w:w="50" w:type="dxa"/>
               <w:left w:w="90" w:type="dxa"/>
@@ -17036,7 +17178,7 @@
         </w:trPr>
         <w:tc>
           <w:tcPr>
-            <w:tcW w:w="4892" w:type="dxa"/>
+            <w:tcW w:w="4952" w:type="dxa"/>
             <w:tcMar>
               <w:top w:w="50" w:type="dxa"/>
               <w:left w:w="90" w:type="dxa"/>
@@ -17056,7 +17198,7 @@
         </w:tc>
         <w:tc>
           <w:tcPr>
-            <w:tcW w:w="2757" w:type="dxa"/>
+            <w:tcW w:w="2611" w:type="dxa"/>
             <w:tcMar>
               <w:top w:w="50" w:type="dxa"/>
               <w:left w:w="90" w:type="dxa"/>
@@ -17078,7 +17220,7 @@
         </w:tc>
         <w:tc>
           <w:tcPr>
-            <w:tcW w:w="5337" w:type="dxa"/>
+            <w:tcW w:w="5402" w:type="dxa"/>
             <w:tcMar>
               <w:top w:w="50" w:type="dxa"/>
               <w:left w:w="90" w:type="dxa"/>
@@ -17098,7 +17240,7 @@
         </w:tc>
         <w:tc>
           <w:tcPr>
-            <w:tcW w:w="1692" w:type="dxa"/>
+            <w:tcW w:w="1713" w:type="dxa"/>
             <w:tcMar>
               <w:top w:w="50" w:type="dxa"/>
               <w:left w:w="90" w:type="dxa"/>
@@ -17123,7 +17265,7 @@
         </w:trPr>
         <w:tc>
           <w:tcPr>
-            <w:tcW w:w="4892" w:type="dxa"/>
+            <w:tcW w:w="4952" w:type="dxa"/>
             <w:tcMar>
               <w:top w:w="50" w:type="dxa"/>
               <w:left w:w="90" w:type="dxa"/>
@@ -17143,7 +17285,7 @@
         </w:tc>
         <w:tc>
           <w:tcPr>
-            <w:tcW w:w="2757" w:type="dxa"/>
+            <w:tcW w:w="2611" w:type="dxa"/>
             <w:tcMar>
               <w:top w:w="50" w:type="dxa"/>
               <w:left w:w="90" w:type="dxa"/>
@@ -17165,7 +17307,7 @@
         </w:tc>
         <w:tc>
           <w:tcPr>
-            <w:tcW w:w="5337" w:type="dxa"/>
+            <w:tcW w:w="5402" w:type="dxa"/>
             <w:tcMar>
               <w:top w:w="50" w:type="dxa"/>
               <w:left w:w="90" w:type="dxa"/>
@@ -17185,7 +17327,7 @@
         </w:tc>
         <w:tc>
           <w:tcPr>
-            <w:tcW w:w="1692" w:type="dxa"/>
+            <w:tcW w:w="1713" w:type="dxa"/>
             <w:tcMar>
               <w:top w:w="50" w:type="dxa"/>
               <w:left w:w="90" w:type="dxa"/>
@@ -17210,7 +17352,7 @@
         </w:trPr>
         <w:tc>
           <w:tcPr>
-            <w:tcW w:w="4892" w:type="dxa"/>
+            <w:tcW w:w="4952" w:type="dxa"/>
             <w:tcMar>
               <w:top w:w="50" w:type="dxa"/>
               <w:left w:w="90" w:type="dxa"/>
@@ -17231,7 +17373,7 @@
         </w:tc>
         <w:tc>
           <w:tcPr>
-            <w:tcW w:w="2757" w:type="dxa"/>
+            <w:tcW w:w="2611" w:type="dxa"/>
             <w:tcMar>
               <w:top w:w="50" w:type="dxa"/>
               <w:left w:w="90" w:type="dxa"/>
@@ -17253,7 +17395,7 @@
         </w:tc>
         <w:tc>
           <w:tcPr>
-            <w:tcW w:w="5337" w:type="dxa"/>
+            <w:tcW w:w="5402" w:type="dxa"/>
             <w:tcMar>
               <w:top w:w="50" w:type="dxa"/>
               <w:left w:w="90" w:type="dxa"/>
@@ -17273,7 +17415,7 @@
         </w:tc>
         <w:tc>
           <w:tcPr>
-            <w:tcW w:w="1692" w:type="dxa"/>
+            <w:tcW w:w="1713" w:type="dxa"/>
             <w:tcMar>
               <w:top w:w="50" w:type="dxa"/>
               <w:left w:w="90" w:type="dxa"/>
@@ -17298,7 +17440,7 @@
         </w:trPr>
         <w:tc>
           <w:tcPr>
-            <w:tcW w:w="4892" w:type="dxa"/>
+            <w:tcW w:w="4952" w:type="dxa"/>
             <w:tcMar>
               <w:top w:w="50" w:type="dxa"/>
               <w:left w:w="90" w:type="dxa"/>
@@ -17318,7 +17460,7 @@
         </w:tc>
         <w:tc>
           <w:tcPr>
-            <w:tcW w:w="2757" w:type="dxa"/>
+            <w:tcW w:w="2611" w:type="dxa"/>
             <w:tcMar>
               <w:top w:w="50" w:type="dxa"/>
               <w:left w:w="90" w:type="dxa"/>
@@ -17340,7 +17482,7 @@
         </w:tc>
         <w:tc>
           <w:tcPr>
-            <w:tcW w:w="5337" w:type="dxa"/>
+            <w:tcW w:w="5402" w:type="dxa"/>
             <w:tcMar>
               <w:top w:w="50" w:type="dxa"/>
               <w:left w:w="90" w:type="dxa"/>
@@ -17360,7 +17502,7 @@
         </w:tc>
         <w:tc>
           <w:tcPr>
-            <w:tcW w:w="1692" w:type="dxa"/>
+            <w:tcW w:w="1713" w:type="dxa"/>
             <w:tcMar>
               <w:top w:w="50" w:type="dxa"/>
               <w:left w:w="90" w:type="dxa"/>
@@ -17385,7 +17527,7 @@
         </w:trPr>
         <w:tc>
           <w:tcPr>
-            <w:tcW w:w="4892" w:type="dxa"/>
+            <w:tcW w:w="4952" w:type="dxa"/>
             <w:tcMar>
               <w:top w:w="50" w:type="dxa"/>
               <w:left w:w="90" w:type="dxa"/>
@@ -17405,7 +17547,7 @@
         </w:tc>
         <w:tc>
           <w:tcPr>
-            <w:tcW w:w="2757" w:type="dxa"/>
+            <w:tcW w:w="2611" w:type="dxa"/>
             <w:tcMar>
               <w:top w:w="50" w:type="dxa"/>
               <w:left w:w="90" w:type="dxa"/>
@@ -17427,7 +17569,7 @@
         </w:tc>
         <w:tc>
           <w:tcPr>
-            <w:tcW w:w="5337" w:type="dxa"/>
+            <w:tcW w:w="5402" w:type="dxa"/>
             <w:tcMar>
               <w:top w:w="50" w:type="dxa"/>
               <w:left w:w="90" w:type="dxa"/>
@@ -17447,7 +17589,7 @@
         </w:tc>
         <w:tc>
           <w:tcPr>
-            <w:tcW w:w="1692" w:type="dxa"/>
+            <w:tcW w:w="1713" w:type="dxa"/>
             <w:tcMar>
               <w:top w:w="50" w:type="dxa"/>
               <w:left w:w="90" w:type="dxa"/>
@@ -17472,7 +17614,7 @@
         </w:trPr>
         <w:tc>
           <w:tcPr>
-            <w:tcW w:w="4892" w:type="dxa"/>
+            <w:tcW w:w="4952" w:type="dxa"/>
             <w:tcMar>
               <w:top w:w="50" w:type="dxa"/>
               <w:left w:w="90" w:type="dxa"/>
@@ -17492,7 +17634,7 @@
         </w:tc>
         <w:tc>
           <w:tcPr>
-            <w:tcW w:w="2757" w:type="dxa"/>
+            <w:tcW w:w="2611" w:type="dxa"/>
             <w:tcMar>
               <w:top w:w="50" w:type="dxa"/>
               <w:left w:w="90" w:type="dxa"/>
@@ -17514,7 +17656,7 @@
         </w:tc>
         <w:tc>
           <w:tcPr>
-            <w:tcW w:w="5337" w:type="dxa"/>
+            <w:tcW w:w="5402" w:type="dxa"/>
             <w:tcMar>
               <w:top w:w="50" w:type="dxa"/>
               <w:left w:w="90" w:type="dxa"/>
@@ -17528,13 +17670,20 @@
                 <w:sz w:val="17"/>
                 <w:szCs w:val="17"/>
               </w:rPr>
-              <w:t>429 RATE_LIMITED; Retry-After 3589 s</w:t>
-            </w:r>
-          </w:p>
-        </w:tc>
-        <w:tc>
-          <w:tcPr>
-            <w:tcW w:w="1692" w:type="dxa"/>
+              <w:t>429 RATE_LIMITED; Retry-A</w:t>
+            </w:r>
+            <w:r>
+              <w:rPr>
+                <w:sz w:val="17"/>
+                <w:szCs w:val="17"/>
+              </w:rPr>
+              <w:t>fter 3589 s</w:t>
+            </w:r>
+          </w:p>
+        </w:tc>
+        <w:tc>
+          <w:tcPr>
+            <w:tcW w:w="1713" w:type="dxa"/>
             <w:tcMar>
               <w:top w:w="50" w:type="dxa"/>
               <w:left w:w="90" w:type="dxa"/>
@@ -17559,7 +17708,7 @@
         </w:trPr>
         <w:tc>
           <w:tcPr>
-            <w:tcW w:w="4892" w:type="dxa"/>
+            <w:tcW w:w="4952" w:type="dxa"/>
             <w:tcMar>
               <w:top w:w="50" w:type="dxa"/>
               <w:left w:w="90" w:type="dxa"/>
@@ -17579,7 +17728,7 @@
         </w:tc>
         <w:tc>
           <w:tcPr>
-            <w:tcW w:w="2757" w:type="dxa"/>
+            <w:tcW w:w="2611" w:type="dxa"/>
             <w:tcMar>
               <w:top w:w="50" w:type="dxa"/>
               <w:left w:w="90" w:type="dxa"/>
@@ -17601,7 +17750,7 @@
         </w:tc>
         <w:tc>
           <w:tcPr>
-            <w:tcW w:w="5337" w:type="dxa"/>
+            <w:tcW w:w="5402" w:type="dxa"/>
             <w:tcMar>
               <w:top w:w="50" w:type="dxa"/>
               <w:left w:w="90" w:type="dxa"/>
@@ -17621,7 +17770,7 @@
         </w:tc>
         <w:tc>
           <w:tcPr>
-            <w:tcW w:w="1692" w:type="dxa"/>
+            <w:tcW w:w="1713" w:type="dxa"/>
             <w:tcMar>
               <w:top w:w="50" w:type="dxa"/>
               <w:left w:w="90" w:type="dxa"/>
@@ -17650,7 +17799,7 @@
       <w:pPr>
         <w:pStyle w:val="Heading2"/>
       </w:pPr>
-      <w:bookmarkStart w:id="6" w:name="_Toc243397822"/>
+      <w:bookmarkStart w:id="6" w:name="_Toc243404780"/>
       <w:r>
         <w:t>5. Audit trail evidence</w:t>
       </w:r>
@@ -17707,10 +17856,7 @@
         <w:t>no row was altered, inserted or removed</w:t>
       </w:r>
       <w:r>
-        <w:t>. Event ty</w:t>
-      </w:r>
-      <w:r>
-        <w:t xml:space="preserve">pes seen: </w:t>
+        <w:t xml:space="preserve">. Event types seen: </w:t>
       </w:r>
       <w:r>
         <w:rPr>
@@ -17719,7 +17865,16 @@
           <w:sz w:val="18"/>
           <w:szCs w:val="18"/>
         </w:rPr>
-        <w:t>USER_REGISTERED</w:t>
+        <w:t>USER_REGISTE</w:t>
+      </w:r>
+      <w:r>
+        <w:rPr>
+          <w:rFonts w:ascii="Consolas" w:eastAsia="Consolas" w:hAnsi="Consolas" w:cs="Consolas"/>
+          <w:color w:val="9A3412"/>
+          <w:sz w:val="18"/>
+          <w:szCs w:val="18"/>
+        </w:rPr>
+        <w:t>RED</w:t>
       </w:r>
       <w:r>
         <w:t xml:space="preserve">, </w:t>
@@ -17887,16 +18042,7 @@
           <w:sz w:val="18"/>
           <w:szCs w:val="18"/>
         </w:rPr>
-        <w:t>DEBT_C</w:t>
-      </w:r>
-      <w:r>
-        <w:rPr>
-          <w:rFonts w:ascii="Consolas" w:eastAsia="Consolas" w:hAnsi="Consolas" w:cs="Consolas"/>
-          <w:color w:val="9A3412"/>
-          <w:sz w:val="18"/>
-          <w:szCs w:val="18"/>
-        </w:rPr>
-        <w:t>REATED</w:t>
+        <w:t>DEBT_CREATED</w:t>
       </w:r>
       <w:r>
         <w:t xml:space="preserve">, </w:t>
@@ -18002,12 +18148,12 @@
       <w:pPr>
         <w:pStyle w:val="Heading2"/>
       </w:pPr>
-      <w:bookmarkStart w:id="7" w:name="_Toc243397823"/>
+      <w:bookmarkStart w:id="7" w:name="_Toc243404781"/>
       <w:r>
-        <w:t xml:space="preserve">6. Screenshots of </w:t>
+        <w:t>6. Screenshots of the simu</w:t>
       </w:r>
       <w:r>
-        <w:t>the simulated account</w:t>
+        <w:t>lated account</w:t>
       </w:r>
       <w:bookmarkEnd w:id="7"/>
     </w:p>
@@ -18017,72 +18163,6 @@
       </w:pPr>
       <w:r>
         <w:t>Captured from the same production build against the same sandbox branch, with a separate fictional account (deleted afterwards).</w:t>
-      </w:r>
-    </w:p>
-    <w:p>
-      <w:pPr>
-        <w:spacing w:before="120" w:after="60"/>
-        <w:jc w:val="center"/>
-      </w:pPr>
-      <w:r>
-        <w:rPr>
-          <w:noProof/>
-        </w:rPr>
-        <w:lastRenderedPageBreak/>
-        <w:drawing>
-          <wp:inline distT="0" distB="0" distL="0" distR="0">
-            <wp:extent cx="9315450" cy="5819775"/>
-            <wp:effectExtent l="0" t="0" r="0" b="0"/>
-            <wp:docPr id="8" name="Picture 8"/>
-            <wp:cNvGraphicFramePr>
-              <a:graphicFrameLocks xmlns:a="http://schemas.openxmlformats.org/drawingml/2006/main" noChangeAspect="1"/>
-            </wp:cNvGraphicFramePr>
-            <a:graphic xmlns:a="http://schemas.openxmlformats.org/drawingml/2006/main">
-              <a:graphicData uri="http://schemas.openxmlformats.org/drawingml/2006/picture">
-                <pic:pic xmlns:pic="http://schemas.openxmlformats.org/drawingml/2006/picture">
-                  <pic:nvPicPr>
-                    <pic:cNvPr id="0" name=""/>
-                    <pic:cNvPicPr>
-                      <a:picLocks noChangeAspect="1" noChangeArrowheads="1"/>
-                    </pic:cNvPicPr>
-                  </pic:nvPicPr>
-                  <pic:blipFill>
-                    <a:blip r:embed="rId8"/>
-                    <a:srcRect/>
-                    <a:stretch>
-                      <a:fillRect/>
-                    </a:stretch>
-                  </pic:blipFill>
-                  <pic:spPr bwMode="auto">
-                    <a:xfrm>
-                      <a:off x="0" y="0"/>
-                      <a:ext cx="9315450" cy="5819775"/>
-                    </a:xfrm>
-                    <a:prstGeom prst="rect">
-                      <a:avLst/>
-                    </a:prstGeom>
-                  </pic:spPr>
-                </pic:pic>
-              </a:graphicData>
-            </a:graphic>
-          </wp:inline>
-        </w:drawing>
-      </w:r>
-    </w:p>
-    <w:p>
-      <w:pPr>
-        <w:spacing w:after="200"/>
-        <w:jc w:val="center"/>
-      </w:pPr>
-      <w:r>
-        <w:rPr>
-          <w:i/>
-          <w:iCs/>
-          <w:color w:val="64748B"/>
-          <w:sz w:val="18"/>
-          <w:szCs w:val="18"/>
-        </w:rPr>
-        <w:t>Figure: Overview with explainable insights</w:t>
       </w:r>
     </w:p>
     <w:p>
@@ -18148,7 +18228,7 @@
           <w:sz w:val="18"/>
           <w:szCs w:val="18"/>
         </w:rPr>
-        <w:t>Figure: Transactions after the statement import</w:t>
+        <w:t>Figure: Overview with explainable insights</w:t>
       </w:r>
     </w:p>
     <w:p>
@@ -18214,7 +18294,7 @@
           <w:sz w:val="18"/>
           <w:szCs w:val="18"/>
         </w:rPr>
-        <w:t>Figure: Planner, Loans: offers compared with fees and affordability</w:t>
+        <w:t>Figure: Transactions after the statement import</w:t>
       </w:r>
     </w:p>
     <w:p>
@@ -18280,7 +18360,17 @@
           <w:sz w:val="18"/>
           <w:szCs w:val="18"/>
         </w:rPr>
-        <w:t>Figure: Planner, Invest: country outlook and history-based mixes</w:t>
+        <w:t>Figure: Planner,</w:t>
+      </w:r>
+      <w:r>
+        <w:rPr>
+          <w:i/>
+          <w:iCs/>
+          <w:color w:val="64748B"/>
+          <w:sz w:val="18"/>
+          <w:szCs w:val="18"/>
+        </w:rPr>
+        <w:t xml:space="preserve"> Loans: offers compared with fees and affordability</w:t>
       </w:r>
     </w:p>
     <w:p>
@@ -18346,7 +18436,7 @@
           <w:sz w:val="18"/>
           <w:szCs w:val="18"/>
         </w:rPr>
-        <w:t>Figure: Copilot: a two-step plan waiting for confirmation</w:t>
+        <w:t>Figure: Planner, Invest: country outlook and history-based mixes</w:t>
       </w:r>
     </w:p>
     <w:p>
@@ -18412,8 +18502,64 @@
           <w:sz w:val="18"/>
           <w:szCs w:val="18"/>
         </w:rPr>
-        <w:t>Figure: Partner offers near you (distance computed on the d</w:t>
+        <w:t>Figure: Copilot: a two-step plan waiting for confirmation</w:t>
       </w:r>
+    </w:p>
+    <w:p>
+      <w:pPr>
+        <w:spacing w:before="120" w:after="60"/>
+        <w:jc w:val="center"/>
+      </w:pPr>
+      <w:r>
+        <w:rPr>
+          <w:noProof/>
+        </w:rPr>
+        <w:lastRenderedPageBreak/>
+        <w:drawing>
+          <wp:inline distT="0" distB="0" distL="0" distR="0">
+            <wp:extent cx="9315450" cy="5819775"/>
+            <wp:effectExtent l="0" t="0" r="0" b="0"/>
+            <wp:docPr id="14" name="Picture 14"/>
+            <wp:cNvGraphicFramePr>
+              <a:graphicFrameLocks xmlns:a="http://schemas.openxmlformats.org/drawingml/2006/main" noChangeAspect="1"/>
+            </wp:cNvGraphicFramePr>
+            <a:graphic xmlns:a="http://schemas.openxmlformats.org/drawingml/2006/main">
+              <a:graphicData uri="http://schemas.openxmlformats.org/drawingml/2006/picture">
+                <pic:pic xmlns:pic="http://schemas.openxmlformats.org/drawingml/2006/picture">
+                  <pic:nvPicPr>
+                    <pic:cNvPr id="0" name=""/>
+                    <pic:cNvPicPr>
+                      <a:picLocks noChangeAspect="1" noChangeArrowheads="1"/>
+                    </pic:cNvPicPr>
+                  </pic:nvPicPr>
+                  <pic:blipFill>
+                    <a:blip r:embed="rId14"/>
+                    <a:srcRect/>
+                    <a:stretch>
+                      <a:fillRect/>
+                    </a:stretch>
+                  </pic:blipFill>
+                  <pic:spPr bwMode="auto">
+                    <a:xfrm>
+                      <a:off x="0" y="0"/>
+                      <a:ext cx="9315450" cy="5819775"/>
+                    </a:xfrm>
+                    <a:prstGeom prst="rect">
+                      <a:avLst/>
+                    </a:prstGeom>
+                  </pic:spPr>
+                </pic:pic>
+              </a:graphicData>
+            </a:graphic>
+          </wp:inline>
+        </w:drawing>
+      </w:r>
+    </w:p>
+    <w:p>
+      <w:pPr>
+        <w:spacing w:after="200"/>
+        <w:jc w:val="center"/>
+      </w:pPr>
       <w:r>
         <w:rPr>
           <w:i/>
@@ -18422,12 +18568,12 @@
           <w:sz w:val="18"/>
           <w:szCs w:val="18"/>
         </w:rPr>
-        <w:t>evice)</w:t>
+        <w:t>Figure: Partner offers near you (distance computed on the device)</w:t>
       </w:r>
     </w:p>
     <w:sectPr>
-      <w:headerReference w:type="default" r:id="rId14"/>
-      <w:footerReference w:type="default" r:id="rId15"/>
+      <w:headerReference w:type="default" r:id="rId15"/>
+      <w:footerReference w:type="default" r:id="rId16"/>
       <w:pgSz w:w="16838" w:h="11906" w:orient="landscape"/>
       <w:pgMar w:top="1080" w:right="1080" w:bottom="1080" w:left="1080" w:header="708" w:footer="708" w:gutter="0"/>
       <w:cols w:space="720"/>
@@ -18607,10 +18753,68 @@
 <file path=word/numbering.xml><?xml version="1.0" encoding="utf-8"?>
 <w:numbering xmlns:wpc="http://schemas.microsoft.com/office/word/2010/wordprocessingCanvas" xmlns:cx="http://schemas.microsoft.com/office/drawing/2014/chartex" xmlns:cx1="http://schemas.microsoft.com/office/drawing/2015/9/8/chartex" xmlns:cx2="http://schemas.microsoft.com/office/drawing/2015/10/21/chartex" xmlns:cx3="http://schemas.microsoft.com/office/drawing/2016/5/9/chartex" xmlns:cx4="http://schemas.microsoft.com/office/drawing/2016/5/10/chartex" xmlns:cx5="http://schemas.microsoft.com/office/drawing/2016/5/11/chartex" xmlns:cx6="http://schemas.microsoft.com/office/drawing/2016/5/12/chartex" xmlns:cx7="http://schemas.microsoft.com/office/drawing/2016/5/13/chartex" xmlns:cx8="http://schemas.microsoft.com/office/drawing/2016/5/14/chartex" xmlns:mc="http://schemas.openxmlformats.org/markup-compatibility/2006" xmlns:aink="http://schemas.microsoft.com/office/drawing/2016/ink" xmlns:am3d="http://schemas.microsoft.com/office/drawing/2017/model3d" xmlns:o="urn:schemas-microsoft-com:office:office" xmlns:r="http://schemas.openxmlformats.org/officeDocument/2006/relationships" xmlns:m="http://schemas.openxmlformats.org/officeDocument/2006/math" xmlns:v="urn:schemas-microsoft-com:vml" xmlns:wp14="http://schemas.microsoft.com/office/word/2010/wordprocessingDrawing" xmlns:wp="http://schemas.openxmlformats.org/drawingml/2006/wordprocessingDrawing" xmlns:w10="urn:schemas-microsoft-com:office:word" xmlns:w="http://schemas.openxmlformats.org/wordprocessingml/2006/main" xmlns:w14="http://schemas.microsoft.com/office/word/2010/wordml" xmlns:w15="http://schemas.microsoft.com/office/word/2012/wordml" xmlns:w16cid="http://schemas.microsoft.com/office/word/2016/wordml/cid" xmlns:w16se="http://schemas.microsoft.com/office/word/2015/wordml/symex" xmlns:wpg="http://schemas.microsoft.com/office/word/2010/wordprocessingGroup" xmlns:wpi="http://schemas.microsoft.com/office/word/2010/wordprocessingInk" xmlns:wne="http://schemas.microsoft.com/office/word/2006/wordml" xmlns:wps="http://schemas.microsoft.com/office/word/2010/wordprocessingShape" mc:Ignorable="w14 w15 w16se w16cid wp14">
   <w:abstractNum w:abstractNumId="0" w15:restartNumberingAfterBreak="0">
-    <w:nsid w:val="2D0B4ACA"/>
+    <w:nsid w:val="394710B2"/>
     <w:multiLevelType w:val="hybridMultilevel"/>
-    <w:tmpl w:val="F8D0EF6A"/>
-    <w:lvl w:ilvl="0" w:tplc="65C6D91C" w:tentative="1">
+    <w:tmpl w:val="4F92088A"/>
+    <w:lvl w:ilvl="0" w:tplc="030A04C4" w:tentative="1">
+      <w:start w:val="1"/>
+      <w:numFmt w:val="decimal"/>
+      <w:lvlText w:val="%1."/>
+      <w:lvlJc w:val="left"/>
+      <w:pPr>
+        <w:ind w:left="400" w:hanging="300"/>
+      </w:pPr>
+    </w:lvl>
+    <w:lvl w:ilvl="1" w:tplc="2F4CD680" w:tentative="1">
+      <w:start w:val="1"/>
+      <w:numFmt w:val="lowerLetter"/>
+      <w:lvlText w:val="%2)"/>
+      <w:lvlJc w:val="left"/>
+      <w:pPr>
+        <w:ind w:left="760" w:hanging="300"/>
+      </w:pPr>
+    </w:lvl>
+    <w:lvl w:ilvl="2" w:tplc="6BAAEC4A">
+      <w:numFmt w:val="decimal"/>
+      <w:lvlText w:val=""/>
+      <w:lvlJc w:val="left"/>
+    </w:lvl>
+    <w:lvl w:ilvl="3" w:tplc="51220CEA">
+      <w:numFmt w:val="decimal"/>
+      <w:lvlText w:val=""/>
+      <w:lvlJc w:val="left"/>
+    </w:lvl>
+    <w:lvl w:ilvl="4" w:tplc="A9E68642">
+      <w:numFmt w:val="decimal"/>
+      <w:lvlText w:val=""/>
+      <w:lvlJc w:val="left"/>
+    </w:lvl>
+    <w:lvl w:ilvl="5" w:tplc="016A9D86">
+      <w:numFmt w:val="decimal"/>
+      <w:lvlText w:val=""/>
+      <w:lvlJc w:val="left"/>
+    </w:lvl>
+    <w:lvl w:ilvl="6" w:tplc="A148DDDC">
+      <w:numFmt w:val="decimal"/>
+      <w:lvlText w:val=""/>
+      <w:lvlJc w:val="left"/>
+    </w:lvl>
+    <w:lvl w:ilvl="7" w:tplc="FC307E66">
+      <w:numFmt w:val="decimal"/>
+      <w:lvlText w:val=""/>
+      <w:lvlJc w:val="left"/>
+    </w:lvl>
+    <w:lvl w:ilvl="8" w:tplc="9D50B23E">
+      <w:numFmt w:val="decimal"/>
+      <w:lvlText w:val=""/>
+      <w:lvlJc w:val="left"/>
+    </w:lvl>
+  </w:abstractNum>
+  <w:abstractNum w:abstractNumId="1" w15:restartNumberingAfterBreak="0">
+    <w:nsid w:val="4C471508"/>
+    <w:multiLevelType w:val="hybridMultilevel"/>
+    <w:tmpl w:val="FE8E1FEC"/>
+    <w:lvl w:ilvl="0" w:tplc="0CE2AD50" w:tentative="1">
       <w:start w:val="1"/>
       <w:numFmt w:val="bullet"/>
       <w:lvlText w:val="•"/>
@@ -18619,7 +18823,7 @@
         <w:ind w:left="400" w:hanging="260"/>
       </w:pPr>
     </w:lvl>
-    <w:lvl w:ilvl="1" w:tplc="A8821AF4" w:tentative="1">
+    <w:lvl w:ilvl="1" w:tplc="49BAF066" w:tentative="1">
       <w:start w:val="1"/>
       <w:numFmt w:val="bullet"/>
       <w:lvlText w:val="–"/>
@@ -18628,105 +18832,47 @@
         <w:ind w:left="760" w:hanging="260"/>
       </w:pPr>
     </w:lvl>
-    <w:lvl w:ilvl="2" w:tplc="4E38443C">
+    <w:lvl w:ilvl="2" w:tplc="293A10D8">
       <w:numFmt w:val="decimal"/>
       <w:lvlText w:val=""/>
       <w:lvlJc w:val="left"/>
     </w:lvl>
-    <w:lvl w:ilvl="3" w:tplc="154C8AA0">
+    <w:lvl w:ilvl="3" w:tplc="A8F4479E">
       <w:numFmt w:val="decimal"/>
       <w:lvlText w:val=""/>
       <w:lvlJc w:val="left"/>
     </w:lvl>
-    <w:lvl w:ilvl="4" w:tplc="C0064A80">
+    <w:lvl w:ilvl="4" w:tplc="F22297B8">
       <w:numFmt w:val="decimal"/>
       <w:lvlText w:val=""/>
       <w:lvlJc w:val="left"/>
     </w:lvl>
-    <w:lvl w:ilvl="5" w:tplc="9C88BD50">
+    <w:lvl w:ilvl="5" w:tplc="E93C607E">
       <w:numFmt w:val="decimal"/>
       <w:lvlText w:val=""/>
       <w:lvlJc w:val="left"/>
     </w:lvl>
-    <w:lvl w:ilvl="6" w:tplc="512C86DA">
+    <w:lvl w:ilvl="6" w:tplc="2E5A99C2">
       <w:numFmt w:val="decimal"/>
       <w:lvlText w:val=""/>
       <w:lvlJc w:val="left"/>
     </w:lvl>
-    <w:lvl w:ilvl="7" w:tplc="F3244EAC">
+    <w:lvl w:ilvl="7" w:tplc="0F244C56">
       <w:numFmt w:val="decimal"/>
       <w:lvlText w:val=""/>
       <w:lvlJc w:val="left"/>
     </w:lvl>
-    <w:lvl w:ilvl="8" w:tplc="6BAE5A4E">
-      <w:numFmt w:val="decimal"/>
-      <w:lvlText w:val=""/>
-      <w:lvlJc w:val="left"/>
-    </w:lvl>
-  </w:abstractNum>
-  <w:abstractNum w:abstractNumId="1" w15:restartNumberingAfterBreak="0">
-    <w:nsid w:val="62E54299"/>
-    <w:multiLevelType w:val="hybridMultilevel"/>
-    <w:tmpl w:val="64BE2870"/>
-    <w:lvl w:ilvl="0" w:tplc="CAA806EA" w:tentative="1">
-      <w:start w:val="1"/>
-      <w:numFmt w:val="decimal"/>
-      <w:lvlText w:val="%1."/>
-      <w:lvlJc w:val="left"/>
-      <w:pPr>
-        <w:ind w:left="400" w:hanging="300"/>
-      </w:pPr>
-    </w:lvl>
-    <w:lvl w:ilvl="1" w:tplc="A7DE962A" w:tentative="1">
-      <w:start w:val="1"/>
-      <w:numFmt w:val="lowerLetter"/>
-      <w:lvlText w:val="%2)"/>
-      <w:lvlJc w:val="left"/>
-      <w:pPr>
-        <w:ind w:left="760" w:hanging="300"/>
-      </w:pPr>
-    </w:lvl>
-    <w:lvl w:ilvl="2" w:tplc="62827E06">
-      <w:numFmt w:val="decimal"/>
-      <w:lvlText w:val=""/>
-      <w:lvlJc w:val="left"/>
-    </w:lvl>
-    <w:lvl w:ilvl="3" w:tplc="1186C000">
-      <w:numFmt w:val="decimal"/>
-      <w:lvlText w:val=""/>
-      <w:lvlJc w:val="left"/>
-    </w:lvl>
-    <w:lvl w:ilvl="4" w:tplc="6114D0C4">
-      <w:numFmt w:val="decimal"/>
-      <w:lvlText w:val=""/>
-      <w:lvlJc w:val="left"/>
-    </w:lvl>
-    <w:lvl w:ilvl="5" w:tplc="A698B508">
-      <w:numFmt w:val="decimal"/>
-      <w:lvlText w:val=""/>
-      <w:lvlJc w:val="left"/>
-    </w:lvl>
-    <w:lvl w:ilvl="6" w:tplc="62A6D860">
-      <w:numFmt w:val="decimal"/>
-      <w:lvlText w:val=""/>
-      <w:lvlJc w:val="left"/>
-    </w:lvl>
-    <w:lvl w:ilvl="7" w:tplc="5D82CCBA">
-      <w:numFmt w:val="decimal"/>
-      <w:lvlText w:val=""/>
-      <w:lvlJc w:val="left"/>
-    </w:lvl>
-    <w:lvl w:ilvl="8" w:tplc="9DCAD97C">
+    <w:lvl w:ilvl="8" w:tplc="EEE67DBE">
       <w:numFmt w:val="decimal"/>
       <w:lvlText w:val=""/>
       <w:lvlJc w:val="left"/>
     </w:lvl>
   </w:abstractNum>
   <w:abstractNum w:abstractNumId="2" w15:restartNumberingAfterBreak="0">
-    <w:nsid w:val="72381984"/>
+    <w:nsid w:val="7EC77C6E"/>
     <w:multiLevelType w:val="hybridMultilevel"/>
-    <w:tmpl w:val="1D3011EC"/>
-    <w:lvl w:ilvl="0" w:tplc="0840FE7A" w:tentative="1">
+    <w:tmpl w:val="A1D87556"/>
+    <w:lvl w:ilvl="0" w:tplc="D390B3CE" w:tentative="1">
       <w:start w:val="1"/>
       <w:numFmt w:val="bullet"/>
       <w:lvlText w:val="●"/>
@@ -18735,7 +18881,7 @@
         <w:ind w:left="720" w:hanging="360"/>
       </w:pPr>
     </w:lvl>
-    <w:lvl w:ilvl="1" w:tplc="55C4BB80" w:tentative="1">
+    <w:lvl w:ilvl="1" w:tplc="6CD8F994" w:tentative="1">
       <w:start w:val="1"/>
       <w:numFmt w:val="bullet"/>
       <w:lvlText w:val="○"/>
@@ -18744,7 +18890,7 @@
         <w:ind w:left="1440" w:hanging="360"/>
       </w:pPr>
     </w:lvl>
-    <w:lvl w:ilvl="2" w:tplc="D1622A60" w:tentative="1">
+    <w:lvl w:ilvl="2" w:tplc="31B0A56C" w:tentative="1">
       <w:start w:val="1"/>
       <w:numFmt w:val="bullet"/>
       <w:lvlText w:val="■"/>
@@ -18753,7 +18899,7 @@
         <w:ind w:left="2160" w:hanging="360"/>
       </w:pPr>
     </w:lvl>
-    <w:lvl w:ilvl="3" w:tplc="ED7663D0" w:tentative="1">
+    <w:lvl w:ilvl="3" w:tplc="9BB6064A" w:tentative="1">
       <w:start w:val="1"/>
       <w:numFmt w:val="bullet"/>
       <w:lvlText w:val="●"/>
@@ -18762,7 +18908,7 @@
         <w:ind w:left="2880" w:hanging="360"/>
       </w:pPr>
     </w:lvl>
-    <w:lvl w:ilvl="4" w:tplc="7E667A08" w:tentative="1">
+    <w:lvl w:ilvl="4" w:tplc="A6C0C6B6" w:tentative="1">
       <w:start w:val="1"/>
       <w:numFmt w:val="bullet"/>
       <w:lvlText w:val="○"/>
@@ -18771,7 +18917,7 @@
         <w:ind w:left="3600" w:hanging="360"/>
       </w:pPr>
     </w:lvl>
-    <w:lvl w:ilvl="5" w:tplc="23CCBFF8" w:tentative="1">
+    <w:lvl w:ilvl="5" w:tplc="E90CF398" w:tentative="1">
       <w:start w:val="1"/>
       <w:numFmt w:val="bullet"/>
       <w:lvlText w:val="■"/>
@@ -18780,7 +18926,7 @@
         <w:ind w:left="4320" w:hanging="360"/>
       </w:pPr>
     </w:lvl>
-    <w:lvl w:ilvl="6" w:tplc="404E6B58" w:tentative="1">
+    <w:lvl w:ilvl="6" w:tplc="AB48869C" w:tentative="1">
       <w:start w:val="1"/>
       <w:numFmt w:val="bullet"/>
       <w:lvlText w:val="●"/>
@@ -18789,7 +18935,7 @@
         <w:ind w:left="5040" w:hanging="360"/>
       </w:pPr>
     </w:lvl>
-    <w:lvl w:ilvl="7" w:tplc="8FC4EA66" w:tentative="1">
+    <w:lvl w:ilvl="7" w:tplc="AFDAE848" w:tentative="1">
       <w:start w:val="1"/>
       <w:numFmt w:val="bullet"/>
       <w:lvlText w:val="●"/>
@@ -18798,7 +18944,7 @@
         <w:ind w:left="5760" w:hanging="360"/>
       </w:pPr>
     </w:lvl>
-    <w:lvl w:ilvl="8" w:tplc="1410E680" w:tentative="1">
+    <w:lvl w:ilvl="8" w:tplc="C5D4D20C" w:tentative="1">
       <w:start w:val="1"/>
       <w:numFmt w:val="bullet"/>
       <w:lvlText w:val="●"/>
@@ -19450,7 +19596,7 @@
     <w:autoRedefine/>
     <w:uiPriority w:val="39"/>
     <w:unhideWhenUsed/>
-    <w:rsid w:val="00300FE8"/>
+    <w:rsid w:val="00CA73DE"/>
     <w:pPr>
       <w:spacing w:after="100"/>
     </w:pPr>
@@ -19462,7 +19608,7 @@
     <w:autoRedefine/>
     <w:uiPriority w:val="39"/>
     <w:unhideWhenUsed/>
-    <w:rsid w:val="00300FE8"/>
+    <w:rsid w:val="00CA73DE"/>
     <w:pPr>
       <w:spacing w:after="100"/>
       <w:ind w:left="210"/>

</xml_diff>